<commit_message>
Update docs: add all 4 student names to report and presentation
</commit_message>
<xml_diff>
--- a/docs/rapport_akri.docx
+++ b/docs/rapport_akri.docx
@@ -119,7 +119,46 @@
           <w:sz w:val="28"/>
           <w:szCs w:val="28"/>
         </w:rPr>
-        <w:t>Hamdi Islem</w:t>
+        <w:t>Hamdi Mohamed Islem</w:t>
+      </w:r>
+    </w:p>
+    <w:p>
+      <w:pPr>
+        <w:jc w:val="center"/>
+      </w:pPr>
+      <w:r>
+        <w:rPr>
+          <w:color w:val="222222"/>
+          <w:sz w:val="28"/>
+          <w:szCs w:val="28"/>
+        </w:rPr>
+        <w:t>Aya Ghernout</w:t>
+      </w:r>
+    </w:p>
+    <w:p>
+      <w:pPr>
+        <w:jc w:val="center"/>
+      </w:pPr>
+      <w:r>
+        <w:rPr>
+          <w:color w:val="222222"/>
+          <w:sz w:val="28"/>
+          <w:szCs w:val="28"/>
+        </w:rPr>
+        <w:t>Meriem Foudi</w:t>
+      </w:r>
+    </w:p>
+    <w:p>
+      <w:pPr>
+        <w:jc w:val="center"/>
+      </w:pPr>
+      <w:r>
+        <w:rPr>
+          <w:color w:val="222222"/>
+          <w:sz w:val="28"/>
+          <w:szCs w:val="28"/>
+        </w:rPr>
+        <w:t>Sidi Yasmine</w:t>
       </w:r>
     </w:p>
     <w:p>

</xml_diff>